<commit_message>
üç geçiş protokolü algoritması eklendi
</commit_message>
<xml_diff>
--- a/BYM468_Helin_Özalkan_220609024_RAPOR4.docx
+++ b/BYM468_Helin_Özalkan_220609024_RAPOR4.docx
@@ -333,13 +333,7 @@
     </w:p>
     <w:p>
       <w:r>
-        <w:t xml:space="preserve">Bu proje, BYM </w:t>
-      </w:r>
-      <w:r>
-        <w:t>468-</w:t>
-      </w:r>
-      <w:r>
-        <w:t xml:space="preserve"> Kriptografi dersi kapsamında verilen "Uygulama Ödevi 4" isterlerini karşılamak amacıyla, daha önce Sezar, Doğrusal ve </w:t>
+        <w:t xml:space="preserve">Bu proje, BYM 468- Kriptografi dersi kapsamında verilen "Uygulama Ödevi 4" isterlerini karşılamak amacıyla, daha önce Sezar, Doğrusal ve </w:t>
       </w:r>
       <w:proofErr w:type="spellStart"/>
       <w:r>
@@ -1837,6 +1831,523 @@
     </w:p>
     <w:p>
       <w:pPr>
+        <w:pStyle w:val="Balk3"/>
+      </w:pPr>
+      <w:r>
+        <w:t>ÖZET-Çalışma Mantığı:</w:t>
+      </w:r>
+    </w:p>
+    <w:p>
+      <w:pPr>
+        <w:pStyle w:val="ListeParagraf"/>
+        <w:numPr>
+          <w:ilvl w:val="0"/>
+          <w:numId w:val="9"/>
+        </w:numPr>
+      </w:pPr>
+      <w:r>
+        <w:t>Ödevde istenen "ikilik sistemde bir düz metin" tarifi, tarayıcı teknolojisindeki en yakın ve ham (</w:t>
+      </w:r>
+      <w:proofErr w:type="spellStart"/>
+      <w:r>
+        <w:t>raw</w:t>
+      </w:r>
+      <w:proofErr w:type="spellEnd"/>
+      <w:r>
+        <w:t xml:space="preserve">) karşılığı olan </w:t>
+      </w:r>
+      <w:proofErr w:type="spellStart"/>
+      <w:r>
+        <w:rPr>
+          <w:b/>
+          <w:bCs/>
+        </w:rPr>
+        <w:t>ImageData</w:t>
+      </w:r>
+      <w:proofErr w:type="spellEnd"/>
+      <w:r>
+        <w:rPr>
+          <w:b/>
+          <w:bCs/>
+        </w:rPr>
+        <w:t xml:space="preserve"> dizisi</w:t>
+      </w:r>
+      <w:r>
+        <w:t xml:space="preserve"> (yani [</w:t>
+      </w:r>
+      <w:proofErr w:type="gramStart"/>
+      <w:r>
+        <w:t>R,G</w:t>
+      </w:r>
+      <w:proofErr w:type="gramEnd"/>
+      <w:r>
+        <w:t>,</w:t>
+      </w:r>
+      <w:proofErr w:type="gramStart"/>
+      <w:r>
+        <w:t>B,A</w:t>
+      </w:r>
+      <w:proofErr w:type="gramEnd"/>
+      <w:r>
+        <w:t xml:space="preserve">, </w:t>
+      </w:r>
+      <w:proofErr w:type="gramStart"/>
+      <w:r>
+        <w:t>R,G</w:t>
+      </w:r>
+      <w:proofErr w:type="gramEnd"/>
+      <w:r>
+        <w:t>,</w:t>
+      </w:r>
+      <w:proofErr w:type="gramStart"/>
+      <w:r>
+        <w:t>B,A</w:t>
+      </w:r>
+      <w:proofErr w:type="gramEnd"/>
+      <w:r>
+        <w:t>, ...] piksel verisi) olarak ele alınmıştır.</w:t>
+      </w:r>
+    </w:p>
+    <w:p>
+      <w:pPr>
+        <w:pStyle w:val="ListeParagraf"/>
+        <w:numPr>
+          <w:ilvl w:val="0"/>
+          <w:numId w:val="9"/>
+        </w:numPr>
+      </w:pPr>
+      <w:r>
+        <w:t xml:space="preserve">"Permütasyon anahtarı kullanarak şifreleme" işlemi, bu ham piksel dizisini anahtar uzunluğu (N) kadar piksellik bloklara ayırarak ve bu N pikselin </w:t>
+      </w:r>
+      <w:r>
+        <w:rPr>
+          <w:b/>
+          <w:bCs/>
+        </w:rPr>
+        <w:t>konumlarını</w:t>
+      </w:r>
+      <w:r>
+        <w:t xml:space="preserve"> anahtara göre (</w:t>
+      </w:r>
+      <w:proofErr w:type="spellStart"/>
+      <w:r>
+        <w:t>örn</w:t>
+      </w:r>
+      <w:proofErr w:type="spellEnd"/>
+      <w:r>
+        <w:t>: "312" anahtarıyla 1. pikseli 3. pikselin yerine) yeniden sıralayarak gerçekleştirilmiştir.</w:t>
+      </w:r>
+    </w:p>
+    <w:p>
+      <w:pPr>
+        <w:pStyle w:val="ListeParagraf"/>
+        <w:numPr>
+          <w:ilvl w:val="0"/>
+          <w:numId w:val="9"/>
+        </w:numPr>
+      </w:pPr>
+      <w:r>
+        <w:t xml:space="preserve"> Ödevin en kritik şartı olan </w:t>
+      </w:r>
+      <w:r>
+        <w:rPr>
+          <w:b/>
+          <w:bCs/>
+        </w:rPr>
+        <w:t>"A resmini şifrelediğinde B ... B şifreli resmini de-şifrelediğinde A resmi oluşmalıdır"</w:t>
+      </w:r>
+      <w:r>
+        <w:t xml:space="preserve"> (kayıpsız deşifreleme) şartını sağlamak için, </w:t>
+      </w:r>
+      <w:proofErr w:type="spellStart"/>
+      <w:r>
+        <w:t>getInverseKey</w:t>
+      </w:r>
+      <w:proofErr w:type="spellEnd"/>
+      <w:r>
+        <w:t xml:space="preserve"> adında özel bir fonksiyon geliştirilmiştir. Bu fonksiyon, şifreleme anahtarının (</w:t>
+      </w:r>
+      <w:proofErr w:type="gramStart"/>
+      <w:r>
+        <w:t>312 -</w:t>
+      </w:r>
+      <w:proofErr w:type="gramEnd"/>
+      <w:r>
+        <w:t>&gt; [2, 0, 1]) matematiksel tersini (</w:t>
+      </w:r>
+      <w:proofErr w:type="gramStart"/>
+      <w:r>
+        <w:t>231 -</w:t>
+      </w:r>
+      <w:proofErr w:type="gramEnd"/>
+      <w:r>
+        <w:t>&gt; [1, 2, 0]) bularak, yerleri değiştirilen piksellerin kayıpsız bir şekilde orijinal konumlarına geri getirilmesini garanti eder.</w:t>
+      </w:r>
+    </w:p>
+    <w:p>
+      <w:pPr>
+        <w:pStyle w:val="ListeParagraf"/>
+        <w:numPr>
+          <w:ilvl w:val="0"/>
+          <w:numId w:val="9"/>
+        </w:numPr>
+      </w:pPr>
+      <w:r>
+        <w:t>Tüm bu yaklaşım, ödevin izin verdiği "uygulamanın yeterlilikleri çerçevesinde (hazır fonksiyonlar, kütüphaneler ile)" tanımına uygun olarak, harici bir kütüphane veya sunucu (Python) olmadan, tamamen tarayıcının yerel (hazır) fonksiyonları (&lt;</w:t>
+      </w:r>
+      <w:proofErr w:type="spellStart"/>
+      <w:r>
+        <w:t>canvas</w:t>
+      </w:r>
+      <w:proofErr w:type="spellEnd"/>
+      <w:r>
+        <w:t xml:space="preserve">&gt;, </w:t>
+      </w:r>
+      <w:proofErr w:type="spellStart"/>
+      <w:r>
+        <w:t>getImageData</w:t>
+      </w:r>
+      <w:proofErr w:type="spellEnd"/>
+      <w:r>
+        <w:t xml:space="preserve">, </w:t>
+      </w:r>
+      <w:proofErr w:type="spellStart"/>
+      <w:r>
+        <w:t>putImageData</w:t>
+      </w:r>
+      <w:proofErr w:type="spellEnd"/>
+      <w:r>
+        <w:t xml:space="preserve"> ve Uint8ClampedArray) kullanılarak '</w:t>
+      </w:r>
+      <w:proofErr w:type="spellStart"/>
+      <w:r>
+        <w:t>Vanilla</w:t>
+      </w:r>
+      <w:proofErr w:type="spellEnd"/>
+      <w:r>
+        <w:t xml:space="preserve"> JavaScript' ile kodlanmıştır. Bölüm 2'de bu fonksiyonlar detaylıca açıklanmıştır.</w:t>
+      </w:r>
+    </w:p>
+    <w:p/>
+    <w:p>
+      <w:pPr>
+        <w:pStyle w:val="Balk3"/>
+      </w:pPr>
+      <w:r>
+        <w:t>ÖZET-</w:t>
+      </w:r>
+      <w:r>
+        <w:t>Kullanılan Fonksiyonlar/Kütüphaneler</w:t>
+      </w:r>
+      <w:r>
+        <w:t>:</w:t>
+      </w:r>
+    </w:p>
+    <w:p>
+      <w:pPr>
+        <w:pStyle w:val="ListeParagraf"/>
+        <w:numPr>
+          <w:ilvl w:val="0"/>
+          <w:numId w:val="10"/>
+        </w:numPr>
+      </w:pPr>
+      <w:proofErr w:type="spellStart"/>
+      <w:proofErr w:type="gramStart"/>
+      <w:r>
+        <w:rPr>
+          <w:b/>
+          <w:bCs/>
+        </w:rPr>
+        <w:t>loadImageToCanvas</w:t>
+      </w:r>
+      <w:proofErr w:type="spellEnd"/>
+      <w:r>
+        <w:rPr>
+          <w:b/>
+          <w:bCs/>
+        </w:rPr>
+        <w:t>(</w:t>
+      </w:r>
+      <w:proofErr w:type="gramEnd"/>
+      <w:r>
+        <w:rPr>
+          <w:b/>
+          <w:bCs/>
+        </w:rPr>
+        <w:t xml:space="preserve">file, </w:t>
+      </w:r>
+      <w:proofErr w:type="spellStart"/>
+      <w:r>
+        <w:rPr>
+          <w:b/>
+          <w:bCs/>
+        </w:rPr>
+        <w:t>canvas</w:t>
+      </w:r>
+      <w:proofErr w:type="spellEnd"/>
+      <w:r>
+        <w:rPr>
+          <w:b/>
+          <w:bCs/>
+        </w:rPr>
+        <w:t>):</w:t>
+      </w:r>
+      <w:r>
+        <w:t xml:space="preserve"> Kullanıcının seçtiği resim dosyasını okur ve bir &lt;</w:t>
+      </w:r>
+      <w:proofErr w:type="spellStart"/>
+      <w:r>
+        <w:t>canvas</w:t>
+      </w:r>
+      <w:proofErr w:type="spellEnd"/>
+      <w:r>
+        <w:t>&gt; elementine çizer. Bu, resmin ham piksel verisine erişmek için zorunlu bir ilk adımdır.</w:t>
+      </w:r>
+    </w:p>
+    <w:p>
+      <w:pPr>
+        <w:pStyle w:val="ListeParagraf"/>
+        <w:numPr>
+          <w:ilvl w:val="0"/>
+          <w:numId w:val="10"/>
+        </w:numPr>
+      </w:pPr>
+      <w:proofErr w:type="spellStart"/>
+      <w:proofErr w:type="gramStart"/>
+      <w:r>
+        <w:rPr>
+          <w:b/>
+          <w:bCs/>
+        </w:rPr>
+        <w:t>parsePermutationKey</w:t>
+      </w:r>
+      <w:proofErr w:type="spellEnd"/>
+      <w:proofErr w:type="gramEnd"/>
+      <w:r>
+        <w:rPr>
+          <w:b/>
+          <w:bCs/>
+        </w:rPr>
+        <w:t>(</w:t>
+      </w:r>
+      <w:proofErr w:type="spellStart"/>
+      <w:r>
+        <w:rPr>
+          <w:b/>
+          <w:bCs/>
+        </w:rPr>
+        <w:t>key</w:t>
+      </w:r>
+      <w:proofErr w:type="spellEnd"/>
+      <w:r>
+        <w:rPr>
+          <w:b/>
+          <w:bCs/>
+        </w:rPr>
+        <w:t>):</w:t>
+      </w:r>
+      <w:r>
+        <w:t xml:space="preserve"> Kullanıcının girdiği "312" gibi (1-indeksli) metin anahtarını alır, doğrular ve programatik olarak kullanılabilen [2, 0, 1] gibi (0-indeksli) bir diziye çevirir.</w:t>
+      </w:r>
+    </w:p>
+    <w:p>
+      <w:pPr>
+        <w:pStyle w:val="ListeParagraf"/>
+        <w:numPr>
+          <w:ilvl w:val="0"/>
+          <w:numId w:val="10"/>
+        </w:numPr>
+      </w:pPr>
+      <w:proofErr w:type="spellStart"/>
+      <w:proofErr w:type="gramStart"/>
+      <w:r>
+        <w:rPr>
+          <w:b/>
+          <w:bCs/>
+        </w:rPr>
+        <w:t>ctx.getImageData</w:t>
+      </w:r>
+      <w:proofErr w:type="spellEnd"/>
+      <w:proofErr w:type="gramEnd"/>
+      <w:r>
+        <w:rPr>
+          <w:b/>
+          <w:bCs/>
+        </w:rPr>
+        <w:t>():</w:t>
+      </w:r>
+      <w:r>
+        <w:t xml:space="preserve"> Ödevde istenen "ikilik sistemde bir düz metin" görevini, resmin tüm piksel verilerini [</w:t>
+      </w:r>
+      <w:proofErr w:type="gramStart"/>
+      <w:r>
+        <w:t>R,G</w:t>
+      </w:r>
+      <w:proofErr w:type="gramEnd"/>
+      <w:r>
+        <w:t>,</w:t>
+      </w:r>
+      <w:proofErr w:type="gramStart"/>
+      <w:r>
+        <w:t>B,A,...</w:t>
+      </w:r>
+      <w:proofErr w:type="gramEnd"/>
+      <w:r>
+        <w:t>] şeklinde tek bir ham veri dizisi olarak alarak yerine getirir.</w:t>
+      </w:r>
+    </w:p>
+    <w:p>
+      <w:pPr>
+        <w:pStyle w:val="ListeParagraf"/>
+        <w:numPr>
+          <w:ilvl w:val="0"/>
+          <w:numId w:val="10"/>
+        </w:numPr>
+      </w:pPr>
+      <w:proofErr w:type="spellStart"/>
+      <w:proofErr w:type="gramStart"/>
+      <w:r>
+        <w:rPr>
+          <w:b/>
+          <w:bCs/>
+        </w:rPr>
+        <w:lastRenderedPageBreak/>
+        <w:t>processImage</w:t>
+      </w:r>
+      <w:proofErr w:type="spellEnd"/>
+      <w:proofErr w:type="gramEnd"/>
+      <w:r>
+        <w:rPr>
+          <w:b/>
+          <w:bCs/>
+        </w:rPr>
+        <w:t>(...):</w:t>
+      </w:r>
+      <w:r>
+        <w:t xml:space="preserve"> Ana şifreleme/de-şifreleme fonksiyonudur. Ham piksel verisini (</w:t>
+      </w:r>
+      <w:proofErr w:type="spellStart"/>
+      <w:r>
+        <w:t>ImageData</w:t>
+      </w:r>
+      <w:proofErr w:type="spellEnd"/>
+      <w:r>
+        <w:t xml:space="preserve">) anahtar uzunluğunda bloklara ayırır ve </w:t>
+      </w:r>
+      <w:proofErr w:type="spellStart"/>
+      <w:r>
+        <w:t>for</w:t>
+      </w:r>
+      <w:proofErr w:type="spellEnd"/>
+      <w:r>
+        <w:t xml:space="preserve"> döngüsü içinde piksellerin </w:t>
+      </w:r>
+      <w:r>
+        <w:rPr>
+          <w:b/>
+          <w:bCs/>
+        </w:rPr>
+        <w:t>konumlarını</w:t>
+      </w:r>
+      <w:r>
+        <w:t xml:space="preserve"> permütasyon anahtarına göre yeniden sıralar.</w:t>
+      </w:r>
+    </w:p>
+    <w:p>
+      <w:pPr>
+        <w:pStyle w:val="ListeParagraf"/>
+        <w:numPr>
+          <w:ilvl w:val="0"/>
+          <w:numId w:val="10"/>
+        </w:numPr>
+      </w:pPr>
+      <w:proofErr w:type="spellStart"/>
+      <w:proofErr w:type="gramStart"/>
+      <w:r>
+        <w:rPr>
+          <w:b/>
+          <w:bCs/>
+        </w:rPr>
+        <w:t>getInverseKey</w:t>
+      </w:r>
+      <w:proofErr w:type="spellEnd"/>
+      <w:proofErr w:type="gramEnd"/>
+      <w:r>
+        <w:rPr>
+          <w:b/>
+          <w:bCs/>
+        </w:rPr>
+        <w:t>(</w:t>
+      </w:r>
+      <w:proofErr w:type="spellStart"/>
+      <w:r>
+        <w:rPr>
+          <w:b/>
+          <w:bCs/>
+        </w:rPr>
+        <w:t>key</w:t>
+      </w:r>
+      <w:proofErr w:type="spellEnd"/>
+      <w:r>
+        <w:rPr>
+          <w:b/>
+          <w:bCs/>
+        </w:rPr>
+        <w:t>):</w:t>
+      </w:r>
+      <w:r>
+        <w:t xml:space="preserve"> De-şifreleme işlemi için şifreleme anahtarının ([2, 0, 1]) matematiksel tersini ([1, 2, 0]) hesaplar. Bu, ödevdeki "B şifreli resmini de-şifrelediğinde A resmi oluşmalıdır" (</w:t>
+      </w:r>
+      <w:proofErr w:type="spellStart"/>
+      <w:r>
+        <w:t>kayıpsızlık</w:t>
+      </w:r>
+      <w:proofErr w:type="spellEnd"/>
+      <w:r>
+        <w:t>) şartını garanti eder.</w:t>
+      </w:r>
+    </w:p>
+    <w:p>
+      <w:pPr>
+        <w:pStyle w:val="ListeParagraf"/>
+        <w:numPr>
+          <w:ilvl w:val="0"/>
+          <w:numId w:val="10"/>
+        </w:numPr>
+      </w:pPr>
+      <w:proofErr w:type="spellStart"/>
+      <w:proofErr w:type="gramStart"/>
+      <w:r>
+        <w:rPr>
+          <w:b/>
+          <w:bCs/>
+        </w:rPr>
+        <w:t>ctx.putImageData</w:t>
+      </w:r>
+      <w:proofErr w:type="spellEnd"/>
+      <w:proofErr w:type="gramEnd"/>
+      <w:r>
+        <w:rPr>
+          <w:b/>
+          <w:bCs/>
+        </w:rPr>
+        <w:t>(...):</w:t>
+      </w:r>
+      <w:r>
+        <w:t xml:space="preserve"> İşlemi tamamlanan (pikselleri karıştırılmış veya düzeltilmiş) ham veri dizisini tekrar görünür bir resme dönüştürür ve sonucu çıkış </w:t>
+      </w:r>
+      <w:proofErr w:type="spellStart"/>
+      <w:r>
+        <w:t>canvas'ına</w:t>
+      </w:r>
+      <w:proofErr w:type="spellEnd"/>
+      <w:r>
+        <w:t xml:space="preserve"> çizer.</w:t>
+      </w:r>
+    </w:p>
+    <w:p/>
+    <w:p>
+      <w:pPr>
         <w:pStyle w:val="Balk2"/>
         <w:rPr>
           <w:b/>
@@ -1878,6 +2389,7 @@
         <w:rPr>
           <w:b/>
           <w:bCs/>
+          <w:noProof/>
         </w:rPr>
         <w:drawing>
           <wp:inline distT="0" distB="0" distL="0" distR="0" wp14:anchorId="3C461D78" wp14:editId="04358B25">
@@ -1992,11 +2504,28 @@
           <w:bCs/>
         </w:rPr>
       </w:pPr>
-      <w:r>
-        <w:rPr>
-          <w:b/>
-          <w:bCs/>
-        </w:rPr>
+    </w:p>
+    <w:p>
+      <w:pPr>
+        <w:rPr>
+          <w:b/>
+          <w:bCs/>
+        </w:rPr>
+      </w:pPr>
+    </w:p>
+    <w:p>
+      <w:pPr>
+        <w:rPr>
+          <w:b/>
+          <w:bCs/>
+        </w:rPr>
+      </w:pPr>
+      <w:r>
+        <w:rPr>
+          <w:b/>
+          <w:bCs/>
+        </w:rPr>
+        <w:lastRenderedPageBreak/>
         <w:t>3.1. Şifreleme Bölümü</w:t>
       </w:r>
     </w:p>
@@ -2066,7 +2595,6 @@
         </w:numPr>
       </w:pPr>
       <w:r>
-        <w:lastRenderedPageBreak/>
         <w:t xml:space="preserve">Sonuç (şifrelenmiş resim), sağdaki </w:t>
       </w:r>
       <w:proofErr w:type="spellStart"/>
@@ -2099,6 +2627,9 @@
     <w:p/>
     <w:p>
       <w:r>
+        <w:rPr>
+          <w:noProof/>
+        </w:rPr>
         <w:drawing>
           <wp:inline distT="0" distB="0" distL="0" distR="0" wp14:anchorId="5B1783EA" wp14:editId="7B7D1D90">
             <wp:extent cx="5760720" cy="2866390"/>
@@ -2309,6 +2840,9 @@
     <w:p/>
     <w:p>
       <w:r>
+        <w:rPr>
+          <w:noProof/>
+        </w:rPr>
         <w:lastRenderedPageBreak/>
         <w:drawing>
           <wp:inline distT="0" distB="0" distL="0" distR="0" wp14:anchorId="2FA8E3B6" wp14:editId="763FCA60">
@@ -2608,21 +3142,7 @@
           <w:b/>
           <w:bCs/>
         </w:rPr>
-        <w:t xml:space="preserve">Şekil </w:t>
-      </w:r>
-      <w:r>
-        <w:rPr>
-          <w:b/>
-          <w:bCs/>
-        </w:rPr>
-        <w:t>4</w:t>
-      </w:r>
-      <w:r>
-        <w:rPr>
-          <w:b/>
-          <w:bCs/>
-        </w:rPr>
-        <w:t>: Solda orijinal köpek resmi, sağda "3</w:t>
+        <w:t>Şekil 4: Solda orijinal köpek resmi, sağda "3</w:t>
       </w:r>
       <w:r>
         <w:rPr>
@@ -2741,6 +3261,9 @@
         </w:tabs>
       </w:pPr>
       <w:r>
+        <w:rPr>
+          <w:noProof/>
+        </w:rPr>
         <w:drawing>
           <wp:inline distT="0" distB="0" distL="0" distR="0" wp14:anchorId="33954D3D" wp14:editId="17742EA2">
             <wp:extent cx="5760720" cy="2865120"/>
@@ -3105,6 +3628,119 @@
 <file path=word/numbering.xml><?xml version="1.0" encoding="utf-8"?>
 <w:numbering xmlns:wpc="http://schemas.microsoft.com/office/word/2010/wordprocessingCanvas" xmlns:cx="http://schemas.microsoft.com/office/drawing/2014/chartex" xmlns:cx1="http://schemas.microsoft.com/office/drawing/2015/9/8/chartex" xmlns:cx2="http://schemas.microsoft.com/office/drawing/2015/10/21/chartex" xmlns:cx3="http://schemas.microsoft.com/office/drawing/2016/5/9/chartex" xmlns:cx4="http://schemas.microsoft.com/office/drawing/2016/5/10/chartex" xmlns:cx5="http://schemas.microsoft.com/office/drawing/2016/5/11/chartex" xmlns:cx6="http://schemas.microsoft.com/office/drawing/2016/5/12/chartex" xmlns:cx7="http://schemas.microsoft.com/office/drawing/2016/5/13/chartex" xmlns:cx8="http://schemas.microsoft.com/office/drawing/2016/5/14/chartex" xmlns:mc="http://schemas.openxmlformats.org/markup-compatibility/2006" xmlns:aink="http://schemas.microsoft.com/office/drawing/2016/ink" xmlns:am3d="http://schemas.microsoft.com/office/drawing/2017/model3d" xmlns:o="urn:schemas-microsoft-com:office:office" xmlns:oel="http://schemas.microsoft.com/office/2019/extlst" xmlns:r="http://schemas.openxmlformats.org/officeDocument/2006/relationships" xmlns:m="http://schemas.openxmlformats.org/officeDocument/2006/math" xmlns:v="urn:schemas-microsoft-com:vml" xmlns:wp14="http://schemas.microsoft.com/office/word/2010/wordprocessingDrawing" xmlns:wp="http://schemas.openxmlformats.org/drawingml/2006/wordprocessingDrawing" xmlns:w10="urn:schemas-microsoft-com:office:word" xmlns:w="http://schemas.openxmlformats.org/wordprocessingml/2006/main" xmlns:w14="http://schemas.microsoft.com/office/word/2010/wordml" xmlns:w15="http://schemas.microsoft.com/office/word/2012/wordml" xmlns:w16cex="http://schemas.microsoft.com/office/word/2018/wordml/cex" xmlns:w16cid="http://schemas.microsoft.com/office/word/2016/wordml/cid" xmlns:w16="http://schemas.microsoft.com/office/word/2018/wordml" xmlns:w16du="http://schemas.microsoft.com/office/word/2023/wordml/word16du" xmlns:w16sdtdh="http://schemas.microsoft.com/office/word/2020/wordml/sdtdatahash" xmlns:w16sdtfl="http://schemas.microsoft.com/office/word/2024/wordml/sdtformatlock" xmlns:w16se="http://schemas.microsoft.com/office/word/2015/wordml/symex" xmlns:wpg="http://schemas.microsoft.com/office/word/2010/wordprocessingGroup" xmlns:wpi="http://schemas.microsoft.com/office/word/2010/wordprocessingInk" xmlns:wne="http://schemas.microsoft.com/office/word/2006/wordml" xmlns:wps="http://schemas.microsoft.com/office/word/2010/wordprocessingShape" mc:Ignorable="w14 w15 w16se w16cid w16 w16cex w16sdtdh w16sdtfl w16du wp14">
   <w:abstractNum w:abstractNumId="0" w15:restartNumberingAfterBreak="0">
+    <w:nsid w:val="00585C23"/>
+    <w:multiLevelType w:val="hybridMultilevel"/>
+    <w:tmpl w:val="A16088EE"/>
+    <w:lvl w:ilvl="0" w:tplc="041F0001">
+      <w:start w:val="1"/>
+      <w:numFmt w:val="bullet"/>
+      <w:lvlText w:val=""/>
+      <w:lvlJc w:val="left"/>
+      <w:pPr>
+        <w:ind w:left="765" w:hanging="360"/>
+      </w:pPr>
+      <w:rPr>
+        <w:rFonts w:ascii="Symbol" w:hAnsi="Symbol" w:hint="default"/>
+      </w:rPr>
+    </w:lvl>
+    <w:lvl w:ilvl="1" w:tplc="041F0003" w:tentative="1">
+      <w:start w:val="1"/>
+      <w:numFmt w:val="bullet"/>
+      <w:lvlText w:val="o"/>
+      <w:lvlJc w:val="left"/>
+      <w:pPr>
+        <w:ind w:left="1485" w:hanging="360"/>
+      </w:pPr>
+      <w:rPr>
+        <w:rFonts w:ascii="Courier New" w:hAnsi="Courier New" w:cs="Courier New" w:hint="default"/>
+      </w:rPr>
+    </w:lvl>
+    <w:lvl w:ilvl="2" w:tplc="041F0005" w:tentative="1">
+      <w:start w:val="1"/>
+      <w:numFmt w:val="bullet"/>
+      <w:lvlText w:val=""/>
+      <w:lvlJc w:val="left"/>
+      <w:pPr>
+        <w:ind w:left="2205" w:hanging="360"/>
+      </w:pPr>
+      <w:rPr>
+        <w:rFonts w:ascii="Wingdings" w:hAnsi="Wingdings" w:hint="default"/>
+      </w:rPr>
+    </w:lvl>
+    <w:lvl w:ilvl="3" w:tplc="041F0001" w:tentative="1">
+      <w:start w:val="1"/>
+      <w:numFmt w:val="bullet"/>
+      <w:lvlText w:val=""/>
+      <w:lvlJc w:val="left"/>
+      <w:pPr>
+        <w:ind w:left="2925" w:hanging="360"/>
+      </w:pPr>
+      <w:rPr>
+        <w:rFonts w:ascii="Symbol" w:hAnsi="Symbol" w:hint="default"/>
+      </w:rPr>
+    </w:lvl>
+    <w:lvl w:ilvl="4" w:tplc="041F0003" w:tentative="1">
+      <w:start w:val="1"/>
+      <w:numFmt w:val="bullet"/>
+      <w:lvlText w:val="o"/>
+      <w:lvlJc w:val="left"/>
+      <w:pPr>
+        <w:ind w:left="3645" w:hanging="360"/>
+      </w:pPr>
+      <w:rPr>
+        <w:rFonts w:ascii="Courier New" w:hAnsi="Courier New" w:cs="Courier New" w:hint="default"/>
+      </w:rPr>
+    </w:lvl>
+    <w:lvl w:ilvl="5" w:tplc="041F0005" w:tentative="1">
+      <w:start w:val="1"/>
+      <w:numFmt w:val="bullet"/>
+      <w:lvlText w:val=""/>
+      <w:lvlJc w:val="left"/>
+      <w:pPr>
+        <w:ind w:left="4365" w:hanging="360"/>
+      </w:pPr>
+      <w:rPr>
+        <w:rFonts w:ascii="Wingdings" w:hAnsi="Wingdings" w:hint="default"/>
+      </w:rPr>
+    </w:lvl>
+    <w:lvl w:ilvl="6" w:tplc="041F0001" w:tentative="1">
+      <w:start w:val="1"/>
+      <w:numFmt w:val="bullet"/>
+      <w:lvlText w:val=""/>
+      <w:lvlJc w:val="left"/>
+      <w:pPr>
+        <w:ind w:left="5085" w:hanging="360"/>
+      </w:pPr>
+      <w:rPr>
+        <w:rFonts w:ascii="Symbol" w:hAnsi="Symbol" w:hint="default"/>
+      </w:rPr>
+    </w:lvl>
+    <w:lvl w:ilvl="7" w:tplc="041F0003" w:tentative="1">
+      <w:start w:val="1"/>
+      <w:numFmt w:val="bullet"/>
+      <w:lvlText w:val="o"/>
+      <w:lvlJc w:val="left"/>
+      <w:pPr>
+        <w:ind w:left="5805" w:hanging="360"/>
+      </w:pPr>
+      <w:rPr>
+        <w:rFonts w:ascii="Courier New" w:hAnsi="Courier New" w:cs="Courier New" w:hint="default"/>
+      </w:rPr>
+    </w:lvl>
+    <w:lvl w:ilvl="8" w:tplc="041F0005" w:tentative="1">
+      <w:start w:val="1"/>
+      <w:numFmt w:val="bullet"/>
+      <w:lvlText w:val=""/>
+      <w:lvlJc w:val="left"/>
+      <w:pPr>
+        <w:ind w:left="6525" w:hanging="360"/>
+      </w:pPr>
+      <w:rPr>
+        <w:rFonts w:ascii="Wingdings" w:hAnsi="Wingdings" w:hint="default"/>
+      </w:rPr>
+    </w:lvl>
+  </w:abstractNum>
+  <w:abstractNum w:abstractNumId="1" w15:restartNumberingAfterBreak="0">
     <w:nsid w:val="05681981"/>
     <w:multiLevelType w:val="multilevel"/>
     <w:tmpl w:val="3642D186"/>
@@ -3253,7 +3889,7 @@
       </w:rPr>
     </w:lvl>
   </w:abstractNum>
-  <w:abstractNum w:abstractNumId="1" w15:restartNumberingAfterBreak="0">
+  <w:abstractNum w:abstractNumId="2" w15:restartNumberingAfterBreak="0">
     <w:nsid w:val="0A784F25"/>
     <w:multiLevelType w:val="multilevel"/>
     <w:tmpl w:val="F33C05B6"/>
@@ -3366,7 +4002,7 @@
       </w:pPr>
     </w:lvl>
   </w:abstractNum>
-  <w:abstractNum w:abstractNumId="2" w15:restartNumberingAfterBreak="0">
+  <w:abstractNum w:abstractNumId="3" w15:restartNumberingAfterBreak="0">
     <w:nsid w:val="20A21B8D"/>
     <w:multiLevelType w:val="multilevel"/>
     <w:tmpl w:val="367EF018"/>
@@ -3515,7 +4151,7 @@
       </w:rPr>
     </w:lvl>
   </w:abstractNum>
-  <w:abstractNum w:abstractNumId="3" w15:restartNumberingAfterBreak="0">
+  <w:abstractNum w:abstractNumId="4" w15:restartNumberingAfterBreak="0">
     <w:nsid w:val="2ECF048E"/>
     <w:multiLevelType w:val="multilevel"/>
     <w:tmpl w:val="E4726FEE"/>
@@ -3664,7 +4300,7 @@
       </w:rPr>
     </w:lvl>
   </w:abstractNum>
-  <w:abstractNum w:abstractNumId="4" w15:restartNumberingAfterBreak="0">
+  <w:abstractNum w:abstractNumId="5" w15:restartNumberingAfterBreak="0">
     <w:nsid w:val="3A905E11"/>
     <w:multiLevelType w:val="multilevel"/>
     <w:tmpl w:val="11B47E60"/>
@@ -3785,7 +4421,7 @@
       </w:pPr>
     </w:lvl>
   </w:abstractNum>
-  <w:abstractNum w:abstractNumId="5" w15:restartNumberingAfterBreak="0">
+  <w:abstractNum w:abstractNumId="6" w15:restartNumberingAfterBreak="0">
     <w:nsid w:val="479842DE"/>
     <w:multiLevelType w:val="multilevel"/>
     <w:tmpl w:val="F5B85282"/>
@@ -3898,7 +4534,120 @@
       </w:pPr>
     </w:lvl>
   </w:abstractNum>
-  <w:abstractNum w:abstractNumId="6" w15:restartNumberingAfterBreak="0">
+  <w:abstractNum w:abstractNumId="7" w15:restartNumberingAfterBreak="0">
+    <w:nsid w:val="52C0494A"/>
+    <w:multiLevelType w:val="hybridMultilevel"/>
+    <w:tmpl w:val="94CCC300"/>
+    <w:lvl w:ilvl="0" w:tplc="041F0001">
+      <w:start w:val="1"/>
+      <w:numFmt w:val="bullet"/>
+      <w:lvlText w:val=""/>
+      <w:lvlJc w:val="left"/>
+      <w:pPr>
+        <w:ind w:left="765" w:hanging="360"/>
+      </w:pPr>
+      <w:rPr>
+        <w:rFonts w:ascii="Symbol" w:hAnsi="Symbol" w:hint="default"/>
+      </w:rPr>
+    </w:lvl>
+    <w:lvl w:ilvl="1" w:tplc="041F0003" w:tentative="1">
+      <w:start w:val="1"/>
+      <w:numFmt w:val="bullet"/>
+      <w:lvlText w:val="o"/>
+      <w:lvlJc w:val="left"/>
+      <w:pPr>
+        <w:ind w:left="1485" w:hanging="360"/>
+      </w:pPr>
+      <w:rPr>
+        <w:rFonts w:ascii="Courier New" w:hAnsi="Courier New" w:cs="Courier New" w:hint="default"/>
+      </w:rPr>
+    </w:lvl>
+    <w:lvl w:ilvl="2" w:tplc="041F0005" w:tentative="1">
+      <w:start w:val="1"/>
+      <w:numFmt w:val="bullet"/>
+      <w:lvlText w:val=""/>
+      <w:lvlJc w:val="left"/>
+      <w:pPr>
+        <w:ind w:left="2205" w:hanging="360"/>
+      </w:pPr>
+      <w:rPr>
+        <w:rFonts w:ascii="Wingdings" w:hAnsi="Wingdings" w:hint="default"/>
+      </w:rPr>
+    </w:lvl>
+    <w:lvl w:ilvl="3" w:tplc="041F0001" w:tentative="1">
+      <w:start w:val="1"/>
+      <w:numFmt w:val="bullet"/>
+      <w:lvlText w:val=""/>
+      <w:lvlJc w:val="left"/>
+      <w:pPr>
+        <w:ind w:left="2925" w:hanging="360"/>
+      </w:pPr>
+      <w:rPr>
+        <w:rFonts w:ascii="Symbol" w:hAnsi="Symbol" w:hint="default"/>
+      </w:rPr>
+    </w:lvl>
+    <w:lvl w:ilvl="4" w:tplc="041F0003" w:tentative="1">
+      <w:start w:val="1"/>
+      <w:numFmt w:val="bullet"/>
+      <w:lvlText w:val="o"/>
+      <w:lvlJc w:val="left"/>
+      <w:pPr>
+        <w:ind w:left="3645" w:hanging="360"/>
+      </w:pPr>
+      <w:rPr>
+        <w:rFonts w:ascii="Courier New" w:hAnsi="Courier New" w:cs="Courier New" w:hint="default"/>
+      </w:rPr>
+    </w:lvl>
+    <w:lvl w:ilvl="5" w:tplc="041F0005" w:tentative="1">
+      <w:start w:val="1"/>
+      <w:numFmt w:val="bullet"/>
+      <w:lvlText w:val=""/>
+      <w:lvlJc w:val="left"/>
+      <w:pPr>
+        <w:ind w:left="4365" w:hanging="360"/>
+      </w:pPr>
+      <w:rPr>
+        <w:rFonts w:ascii="Wingdings" w:hAnsi="Wingdings" w:hint="default"/>
+      </w:rPr>
+    </w:lvl>
+    <w:lvl w:ilvl="6" w:tplc="041F0001" w:tentative="1">
+      <w:start w:val="1"/>
+      <w:numFmt w:val="bullet"/>
+      <w:lvlText w:val=""/>
+      <w:lvlJc w:val="left"/>
+      <w:pPr>
+        <w:ind w:left="5085" w:hanging="360"/>
+      </w:pPr>
+      <w:rPr>
+        <w:rFonts w:ascii="Symbol" w:hAnsi="Symbol" w:hint="default"/>
+      </w:rPr>
+    </w:lvl>
+    <w:lvl w:ilvl="7" w:tplc="041F0003" w:tentative="1">
+      <w:start w:val="1"/>
+      <w:numFmt w:val="bullet"/>
+      <w:lvlText w:val="o"/>
+      <w:lvlJc w:val="left"/>
+      <w:pPr>
+        <w:ind w:left="5805" w:hanging="360"/>
+      </w:pPr>
+      <w:rPr>
+        <w:rFonts w:ascii="Courier New" w:hAnsi="Courier New" w:cs="Courier New" w:hint="default"/>
+      </w:rPr>
+    </w:lvl>
+    <w:lvl w:ilvl="8" w:tplc="041F0005" w:tentative="1">
+      <w:start w:val="1"/>
+      <w:numFmt w:val="bullet"/>
+      <w:lvlText w:val=""/>
+      <w:lvlJc w:val="left"/>
+      <w:pPr>
+        <w:ind w:left="6525" w:hanging="360"/>
+      </w:pPr>
+      <w:rPr>
+        <w:rFonts w:ascii="Wingdings" w:hAnsi="Wingdings" w:hint="default"/>
+      </w:rPr>
+    </w:lvl>
+  </w:abstractNum>
+  <w:abstractNum w:abstractNumId="8" w15:restartNumberingAfterBreak="0">
     <w:nsid w:val="6B3774B6"/>
     <w:multiLevelType w:val="multilevel"/>
     <w:tmpl w:val="93628004"/>
@@ -4011,7 +4760,7 @@
       </w:pPr>
     </w:lvl>
   </w:abstractNum>
-  <w:abstractNum w:abstractNumId="7" w15:restartNumberingAfterBreak="0">
+  <w:abstractNum w:abstractNumId="9" w15:restartNumberingAfterBreak="0">
     <w:nsid w:val="700C3AC6"/>
     <w:multiLevelType w:val="multilevel"/>
     <w:tmpl w:val="08027D62"/>
@@ -4161,28 +4910,34 @@
     </w:lvl>
   </w:abstractNum>
   <w:num w:numId="1" w16cid:durableId="1227300595">
+    <w:abstractNumId w:val="1"/>
+  </w:num>
+  <w:num w:numId="2" w16cid:durableId="1035420527">
+    <w:abstractNumId w:val="9"/>
+  </w:num>
+  <w:num w:numId="3" w16cid:durableId="802507849">
+    <w:abstractNumId w:val="4"/>
+  </w:num>
+  <w:num w:numId="4" w16cid:durableId="1123692813">
+    <w:abstractNumId w:val="5"/>
+  </w:num>
+  <w:num w:numId="5" w16cid:durableId="1503273489">
+    <w:abstractNumId w:val="8"/>
+  </w:num>
+  <w:num w:numId="6" w16cid:durableId="1479570755">
+    <w:abstractNumId w:val="6"/>
+  </w:num>
+  <w:num w:numId="7" w16cid:durableId="687221663">
+    <w:abstractNumId w:val="3"/>
+  </w:num>
+  <w:num w:numId="8" w16cid:durableId="908224178">
+    <w:abstractNumId w:val="2"/>
+  </w:num>
+  <w:num w:numId="9" w16cid:durableId="1704208679">
     <w:abstractNumId w:val="0"/>
   </w:num>
-  <w:num w:numId="2" w16cid:durableId="1035420527">
+  <w:num w:numId="10" w16cid:durableId="2030911086">
     <w:abstractNumId w:val="7"/>
-  </w:num>
-  <w:num w:numId="3" w16cid:durableId="802507849">
-    <w:abstractNumId w:val="3"/>
-  </w:num>
-  <w:num w:numId="4" w16cid:durableId="1123692813">
-    <w:abstractNumId w:val="4"/>
-  </w:num>
-  <w:num w:numId="5" w16cid:durableId="1503273489">
-    <w:abstractNumId w:val="6"/>
-  </w:num>
-  <w:num w:numId="6" w16cid:durableId="1479570755">
-    <w:abstractNumId w:val="5"/>
-  </w:num>
-  <w:num w:numId="7" w16cid:durableId="687221663">
-    <w:abstractNumId w:val="2"/>
-  </w:num>
-  <w:num w:numId="8" w16cid:durableId="908224178">
-    <w:abstractNumId w:val="1"/>
   </w:num>
 </w:numbering>
 </file>

</xml_diff>